<commit_message>
1.7 测试通过 + 接线图V4.0(PA1/PA2)
</commit_message>
<xml_diff>
--- a/Docs/吹雪机控制系统接线图.docx
+++ b/Docs/吹雪机控制系统接线图.docx
@@ -20,7 +20,7 @@
           <w:color w:val="555555"/>
           <w:sz w:val="22"/>
         </w:rPr>
-        <w:t>5A 单路 H 桥 GZ-PMDC-120A7T | STM32F103C8T6 | 2026-08-09 | V3.0</w:t>
+        <w:t>5A 单路 H 桥 GZ-PMDC-120A7T | STM32F103C8T6 | 2026-08-09 | V4.0</w:t>
       </w:r>
     </w:p>
     <w:p>
@@ -1181,7 +1181,7 @@
                 <w:b w:val="0"/>
                 <w:sz w:val="20"/>
               </w:rPr>
-              <w:t>STM32 PB12</w:t>
+              <w:t>STM32 PA1</w:t>
             </w:r>
           </w:p>
         </w:tc>
@@ -1231,7 +1231,7 @@
                 <w:b w:val="0"/>
                 <w:sz w:val="20"/>
               </w:rPr>
-              <w:t>STM32 PB13</w:t>
+              <w:t>STM32 PA2</w:t>
             </w:r>
           </w:p>
         </w:tc>
@@ -1748,7 +1748,7 @@
                 <w:b w:val="0"/>
                 <w:sz w:val="20"/>
               </w:rPr>
-              <w:t>PB12</w:t>
+              <w:t>PA1</w:t>
             </w:r>
           </w:p>
         </w:tc>
@@ -1814,7 +1814,7 @@
                 <w:b w:val="0"/>
                 <w:sz w:val="20"/>
               </w:rPr>
-              <w:t>PB13</w:t>
+              <w:t>PA2</w:t>
             </w:r>
           </w:p>
         </w:tc>

</xml_diff>